<commit_message>
fix: material faltante commit anterior
</commit_message>
<xml_diff>
--- a/Aula3/apostila_aula3_sass_css_avancado.docx
+++ b/Aula3/apostila_aula3_sass_css_avancado.docx
@@ -716,6 +716,11 @@
                 <w:rStyle w:val="Vnculodendice"/>
               </w:rPr>
               <w:t>1. Preparação — Fluxo Git antes de começar</w:t>
+            </w:r>
+            <w:r>
+              <w:rPr>
+                <w:rStyle w:val="Vnculodendice"/>
+              </w:rPr>
               <w:tab/>
               <w:t>4</w:t>
             </w:r>
@@ -3509,7 +3514,7 @@
     <w:p>
       <w:pPr>
         <w:pStyle w:val="Heading2"/>
-        <w:spacing w:before="280" w:after="120"/>
+        <w:spacing w:before="0" w:after="120"/>
         <w:rPr/>
       </w:pPr>
       <w:bookmarkStart w:id="7" w:name="__RefHeading___Toc2841_3313738773"/>
@@ -3735,15 +3740,15 @@
         </w:tblCellMar>
       </w:tblPr>
       <w:tblGrid>
-        <w:gridCol w:w="2797"/>
-        <w:gridCol w:w="3283"/>
+        <w:gridCol w:w="2795"/>
+        <w:gridCol w:w="3285"/>
         <w:gridCol w:w="3280"/>
       </w:tblGrid>
       <w:tr>
         <w:trPr/>
         <w:tc>
           <w:tcPr>
-            <w:tcW w:w="2797" w:type="dxa"/>
+            <w:tcW w:w="2795" w:type="dxa"/>
             <w:tcBorders>
               <w:top w:val="single" w:sz="2" w:space="0" w:color="CCCCCC"/>
               <w:left w:val="single" w:sz="2" w:space="0" w:color="CCCCCC"/>
@@ -3772,7 +3777,7 @@
         </w:tc>
         <w:tc>
           <w:tcPr>
-            <w:tcW w:w="3283" w:type="dxa"/>
+            <w:tcW w:w="3285" w:type="dxa"/>
             <w:tcBorders>
               <w:top w:val="single" w:sz="2" w:space="0" w:color="CCCCCC"/>
               <w:left w:val="single" w:sz="2" w:space="0" w:color="CCCCCC"/>
@@ -3833,7 +3838,7 @@
         <w:trPr/>
         <w:tc>
           <w:tcPr>
-            <w:tcW w:w="2797" w:type="dxa"/>
+            <w:tcW w:w="2795" w:type="dxa"/>
             <w:tcBorders>
               <w:top w:val="single" w:sz="2" w:space="0" w:color="CCCCCC"/>
               <w:left w:val="single" w:sz="2" w:space="0" w:color="CCCCCC"/>
@@ -3866,7 +3871,7 @@
         </w:tc>
         <w:tc>
           <w:tcPr>
-            <w:tcW w:w="3283" w:type="dxa"/>
+            <w:tcW w:w="3285" w:type="dxa"/>
             <w:tcBorders>
               <w:top w:val="single" w:sz="2" w:space="0" w:color="CCCCCC"/>
               <w:left w:val="single" w:sz="2" w:space="0" w:color="CCCCCC"/>
@@ -3931,7 +3936,7 @@
         <w:trPr/>
         <w:tc>
           <w:tcPr>
-            <w:tcW w:w="2797" w:type="dxa"/>
+            <w:tcW w:w="2795" w:type="dxa"/>
             <w:tcBorders>
               <w:top w:val="single" w:sz="2" w:space="0" w:color="CCCCCC"/>
               <w:left w:val="single" w:sz="2" w:space="0" w:color="CCCCCC"/>
@@ -3964,7 +3969,7 @@
         </w:tc>
         <w:tc>
           <w:tcPr>
-            <w:tcW w:w="3283" w:type="dxa"/>
+            <w:tcW w:w="3285" w:type="dxa"/>
             <w:tcBorders>
               <w:top w:val="single" w:sz="2" w:space="0" w:color="CCCCCC"/>
               <w:left w:val="single" w:sz="2" w:space="0" w:color="CCCCCC"/>
@@ -4029,7 +4034,7 @@
         <w:trPr/>
         <w:tc>
           <w:tcPr>
-            <w:tcW w:w="2797" w:type="dxa"/>
+            <w:tcW w:w="2795" w:type="dxa"/>
             <w:tcBorders>
               <w:top w:val="single" w:sz="2" w:space="0" w:color="CCCCCC"/>
               <w:left w:val="single" w:sz="2" w:space="0" w:color="CCCCCC"/>
@@ -4062,7 +4067,7 @@
         </w:tc>
         <w:tc>
           <w:tcPr>
-            <w:tcW w:w="3283" w:type="dxa"/>
+            <w:tcW w:w="3285" w:type="dxa"/>
             <w:tcBorders>
               <w:top w:val="single" w:sz="2" w:space="0" w:color="CCCCCC"/>
               <w:left w:val="single" w:sz="2" w:space="0" w:color="CCCCCC"/>
@@ -4127,7 +4132,7 @@
         <w:trPr/>
         <w:tc>
           <w:tcPr>
-            <w:tcW w:w="2797" w:type="dxa"/>
+            <w:tcW w:w="2795" w:type="dxa"/>
             <w:tcBorders>
               <w:top w:val="single" w:sz="2" w:space="0" w:color="CCCCCC"/>
               <w:left w:val="single" w:sz="2" w:space="0" w:color="CCCCCC"/>
@@ -4160,7 +4165,7 @@
         </w:tc>
         <w:tc>
           <w:tcPr>
-            <w:tcW w:w="3283" w:type="dxa"/>
+            <w:tcW w:w="3285" w:type="dxa"/>
             <w:tcBorders>
               <w:top w:val="single" w:sz="2" w:space="0" w:color="CCCCCC"/>
               <w:left w:val="single" w:sz="2" w:space="0" w:color="CCCCCC"/>
@@ -4225,7 +4230,7 @@
         <w:trPr/>
         <w:tc>
           <w:tcPr>
-            <w:tcW w:w="2797" w:type="dxa"/>
+            <w:tcW w:w="2795" w:type="dxa"/>
             <w:tcBorders>
               <w:top w:val="single" w:sz="2" w:space="0" w:color="CCCCCC"/>
               <w:left w:val="single" w:sz="2" w:space="0" w:color="CCCCCC"/>
@@ -4258,7 +4263,7 @@
         </w:tc>
         <w:tc>
           <w:tcPr>
-            <w:tcW w:w="3283" w:type="dxa"/>
+            <w:tcW w:w="3285" w:type="dxa"/>
             <w:tcBorders>
               <w:top w:val="single" w:sz="2" w:space="0" w:color="CCCCCC"/>
               <w:left w:val="single" w:sz="2" w:space="0" w:color="CCCCCC"/>
@@ -4323,7 +4328,7 @@
         <w:trPr/>
         <w:tc>
           <w:tcPr>
-            <w:tcW w:w="2797" w:type="dxa"/>
+            <w:tcW w:w="2795" w:type="dxa"/>
             <w:tcBorders>
               <w:top w:val="single" w:sz="2" w:space="0" w:color="CCCCCC"/>
               <w:left w:val="single" w:sz="2" w:space="0" w:color="CCCCCC"/>
@@ -4356,7 +4361,7 @@
         </w:tc>
         <w:tc>
           <w:tcPr>
-            <w:tcW w:w="3283" w:type="dxa"/>
+            <w:tcW w:w="3285" w:type="dxa"/>
             <w:tcBorders>
               <w:top w:val="single" w:sz="2" w:space="0" w:color="CCCCCC"/>
               <w:left w:val="single" w:sz="2" w:space="0" w:color="CCCCCC"/>
@@ -6620,15 +6625,15 @@
         </w:tblCellMar>
       </w:tblPr>
       <w:tblGrid>
-        <w:gridCol w:w="2797"/>
-        <w:gridCol w:w="3283"/>
+        <w:gridCol w:w="2795"/>
+        <w:gridCol w:w="3285"/>
         <w:gridCol w:w="3280"/>
       </w:tblGrid>
       <w:tr>
         <w:trPr/>
         <w:tc>
           <w:tcPr>
-            <w:tcW w:w="2797" w:type="dxa"/>
+            <w:tcW w:w="2795" w:type="dxa"/>
             <w:tcBorders>
               <w:top w:val="single" w:sz="2" w:space="0" w:color="CCCCCC"/>
               <w:left w:val="single" w:sz="2" w:space="0" w:color="CCCCCC"/>
@@ -6657,7 +6662,7 @@
         </w:tc>
         <w:tc>
           <w:tcPr>
-            <w:tcW w:w="3283" w:type="dxa"/>
+            <w:tcW w:w="3285" w:type="dxa"/>
             <w:tcBorders>
               <w:top w:val="single" w:sz="2" w:space="0" w:color="CCCCCC"/>
               <w:left w:val="single" w:sz="2" w:space="0" w:color="CCCCCC"/>
@@ -6718,7 +6723,7 @@
         <w:trPr/>
         <w:tc>
           <w:tcPr>
-            <w:tcW w:w="2797" w:type="dxa"/>
+            <w:tcW w:w="2795" w:type="dxa"/>
             <w:tcBorders>
               <w:top w:val="single" w:sz="2" w:space="0" w:color="CCCCCC"/>
               <w:left w:val="single" w:sz="2" w:space="0" w:color="CCCCCC"/>
@@ -6751,7 +6756,7 @@
         </w:tc>
         <w:tc>
           <w:tcPr>
-            <w:tcW w:w="3283" w:type="dxa"/>
+            <w:tcW w:w="3285" w:type="dxa"/>
             <w:tcBorders>
               <w:top w:val="single" w:sz="2" w:space="0" w:color="CCCCCC"/>
               <w:left w:val="single" w:sz="2" w:space="0" w:color="CCCCCC"/>
@@ -6816,7 +6821,7 @@
         <w:trPr/>
         <w:tc>
           <w:tcPr>
-            <w:tcW w:w="2797" w:type="dxa"/>
+            <w:tcW w:w="2795" w:type="dxa"/>
             <w:tcBorders>
               <w:top w:val="single" w:sz="2" w:space="0" w:color="CCCCCC"/>
               <w:left w:val="single" w:sz="2" w:space="0" w:color="CCCCCC"/>
@@ -6849,7 +6854,7 @@
         </w:tc>
         <w:tc>
           <w:tcPr>
-            <w:tcW w:w="3283" w:type="dxa"/>
+            <w:tcW w:w="3285" w:type="dxa"/>
             <w:tcBorders>
               <w:top w:val="single" w:sz="2" w:space="0" w:color="CCCCCC"/>
               <w:left w:val="single" w:sz="2" w:space="0" w:color="CCCCCC"/>
@@ -6914,7 +6919,7 @@
         <w:trPr/>
         <w:tc>
           <w:tcPr>
-            <w:tcW w:w="2797" w:type="dxa"/>
+            <w:tcW w:w="2795" w:type="dxa"/>
             <w:tcBorders>
               <w:top w:val="single" w:sz="2" w:space="0" w:color="CCCCCC"/>
               <w:left w:val="single" w:sz="2" w:space="0" w:color="CCCCCC"/>
@@ -6947,7 +6952,7 @@
         </w:tc>
         <w:tc>
           <w:tcPr>
-            <w:tcW w:w="3283" w:type="dxa"/>
+            <w:tcW w:w="3285" w:type="dxa"/>
             <w:tcBorders>
               <w:top w:val="single" w:sz="2" w:space="0" w:color="CCCCCC"/>
               <w:left w:val="single" w:sz="2" w:space="0" w:color="CCCCCC"/>
@@ -7012,7 +7017,7 @@
         <w:trPr/>
         <w:tc>
           <w:tcPr>
-            <w:tcW w:w="2797" w:type="dxa"/>
+            <w:tcW w:w="2795" w:type="dxa"/>
             <w:tcBorders>
               <w:top w:val="single" w:sz="2" w:space="0" w:color="CCCCCC"/>
               <w:left w:val="single" w:sz="2" w:space="0" w:color="CCCCCC"/>
@@ -7045,7 +7050,7 @@
         </w:tc>
         <w:tc>
           <w:tcPr>
-            <w:tcW w:w="3283" w:type="dxa"/>
+            <w:tcW w:w="3285" w:type="dxa"/>
             <w:tcBorders>
               <w:top w:val="single" w:sz="2" w:space="0" w:color="CCCCCC"/>
               <w:left w:val="single" w:sz="2" w:space="0" w:color="CCCCCC"/>
@@ -7110,7 +7115,7 @@
         <w:trPr/>
         <w:tc>
           <w:tcPr>
-            <w:tcW w:w="2797" w:type="dxa"/>
+            <w:tcW w:w="2795" w:type="dxa"/>
             <w:tcBorders>
               <w:top w:val="single" w:sz="2" w:space="0" w:color="CCCCCC"/>
               <w:left w:val="single" w:sz="2" w:space="0" w:color="CCCCCC"/>
@@ -7143,7 +7148,7 @@
         </w:tc>
         <w:tc>
           <w:tcPr>
-            <w:tcW w:w="3283" w:type="dxa"/>
+            <w:tcW w:w="3285" w:type="dxa"/>
             <w:tcBorders>
               <w:top w:val="single" w:sz="2" w:space="0" w:color="CCCCCC"/>
               <w:left w:val="single" w:sz="2" w:space="0" w:color="CCCCCC"/>
@@ -7208,7 +7213,7 @@
         <w:trPr/>
         <w:tc>
           <w:tcPr>
-            <w:tcW w:w="2797" w:type="dxa"/>
+            <w:tcW w:w="2795" w:type="dxa"/>
             <w:tcBorders>
               <w:top w:val="single" w:sz="2" w:space="0" w:color="CCCCCC"/>
               <w:left w:val="single" w:sz="2" w:space="0" w:color="CCCCCC"/>
@@ -7241,7 +7246,7 @@
         </w:tc>
         <w:tc>
           <w:tcPr>
-            <w:tcW w:w="3283" w:type="dxa"/>
+            <w:tcW w:w="3285" w:type="dxa"/>
             <w:tcBorders>
               <w:top w:val="single" w:sz="2" w:space="0" w:color="CCCCCC"/>
               <w:left w:val="single" w:sz="2" w:space="0" w:color="CCCCCC"/>
@@ -21513,7 +21518,14 @@
       <w:pPr>
         <w:pStyle w:val="Heading2"/>
         <w:spacing w:before="280" w:after="120"/>
-        <w:rPr/>
+        <w:rPr>
+          <w:rFonts w:eastAsia="Arial" w:cs="Arial"/>
+          <w:b/>
+          <w:bCs/>
+          <w:color w:val="2E6DA4"/>
+          <w:sz w:val="28"/>
+          <w:szCs w:val="28"/>
+        </w:rPr>
       </w:pPr>
       <w:bookmarkStart w:id="51" w:name="__RefHeading___Toc2929_3313738773"/>
       <w:bookmarkEnd w:id="51"/>
@@ -21534,10 +21546,15 @@
         <w:pStyle w:val="ListParagraph"/>
         <w:numPr>
           <w:ilvl w:val="0"/>
-          <w:numId w:val="13"/>
+          <w:numId w:val="17"/>
         </w:numPr>
         <w:spacing w:lineRule="auto" w:line="341" w:before="60" w:after="60"/>
-        <w:rPr/>
+        <w:rPr>
+          <w:rFonts w:eastAsia="Arial" w:cs="Arial"/>
+          <w:color w:val="000000"/>
+          <w:sz w:val="22"/>
+          <w:szCs w:val="22"/>
+        </w:rPr>
       </w:pPr>
       <w:r>
         <w:rPr>
@@ -21546,7 +21563,7 @@
           <w:sz w:val="22"/>
           <w:szCs w:val="22"/>
         </w:rPr>
-        <w:t>Branch feature-sass criada a partir da main atualizada</w:t>
+        <w:t>Envie para main o código da funcionalidade de ferramentas de desenvolvimento, caso esteja concluido;</w:t>
       </w:r>
     </w:p>
     <w:p>
@@ -21554,7 +21571,32 @@
         <w:pStyle w:val="ListParagraph"/>
         <w:numPr>
           <w:ilvl w:val="0"/>
-          <w:numId w:val="14"/>
+          <w:numId w:val="18"/>
+        </w:numPr>
+        <w:spacing w:lineRule="auto" w:line="341" w:before="60" w:after="60"/>
+        <w:rPr>
+          <w:rFonts w:eastAsia="Arial" w:cs="Arial"/>
+          <w:color w:val="000000"/>
+          <w:sz w:val="22"/>
+          <w:szCs w:val="22"/>
+        </w:rPr>
+      </w:pPr>
+      <w:r>
+        <w:rPr>
+          <w:rFonts w:eastAsia="Arial" w:cs="Arial"/>
+          <w:color w:val="000000"/>
+          <w:sz w:val="22"/>
+          <w:szCs w:val="22"/>
+        </w:rPr>
+        <w:t>Criar branch feature-sass a partir da main atualizada;</w:t>
+      </w:r>
+    </w:p>
+    <w:p>
+      <w:pPr>
+        <w:pStyle w:val="ListParagraph"/>
+        <w:numPr>
+          <w:ilvl w:val="0"/>
+          <w:numId w:val="19"/>
         </w:numPr>
         <w:spacing w:lineRule="auto" w:line="341" w:before="60" w:after="60"/>
         <w:rPr>
@@ -21579,7 +21621,7 @@
         <w:pStyle w:val="ListParagraph"/>
         <w:numPr>
           <w:ilvl w:val="0"/>
-          <w:numId w:val="15"/>
+          <w:numId w:val="20"/>
         </w:numPr>
         <w:spacing w:lineRule="auto" w:line="341" w:before="60" w:after="60"/>
         <w:rPr>
@@ -21604,7 +21646,7 @@
         <w:pStyle w:val="ListParagraph"/>
         <w:numPr>
           <w:ilvl w:val="0"/>
-          <w:numId w:val="16"/>
+          <w:numId w:val="21"/>
         </w:numPr>
         <w:spacing w:lineRule="auto" w:line="341" w:before="60" w:after="60"/>
         <w:rPr>
@@ -21622,6 +21664,56 @@
           <w:szCs w:val="22"/>
         </w:rPr>
         <w:t>Adicione dois novos temas de cores ao site/aplicação (você pode escolher quais conjuntos de estilos vai utilizar em cada tema);</w:t>
+      </w:r>
+    </w:p>
+    <w:p>
+      <w:pPr>
+        <w:pStyle w:val="ListParagraph"/>
+        <w:numPr>
+          <w:ilvl w:val="0"/>
+          <w:numId w:val="22"/>
+        </w:numPr>
+        <w:spacing w:lineRule="auto" w:line="341" w:before="60" w:after="60"/>
+        <w:rPr>
+          <w:rFonts w:eastAsia="Arial" w:cs="Arial"/>
+          <w:color w:val="000000"/>
+          <w:sz w:val="22"/>
+          <w:szCs w:val="22"/>
+        </w:rPr>
+      </w:pPr>
+      <w:r>
+        <w:rPr>
+          <w:rFonts w:eastAsia="Arial" w:cs="Arial"/>
+          <w:color w:val="000000"/>
+          <w:sz w:val="22"/>
+          <w:szCs w:val="22"/>
+        </w:rPr>
+        <w:t>O layout do site/aplicação deve ser responsivo;</w:t>
+      </w:r>
+    </w:p>
+    <w:p>
+      <w:pPr>
+        <w:pStyle w:val="ListParagraph"/>
+        <w:numPr>
+          <w:ilvl w:val="0"/>
+          <w:numId w:val="23"/>
+        </w:numPr>
+        <w:spacing w:lineRule="auto" w:line="341" w:before="60" w:after="60"/>
+        <w:rPr>
+          <w:rFonts w:eastAsia="Arial" w:cs="Arial"/>
+          <w:color w:val="000000"/>
+          <w:sz w:val="22"/>
+          <w:szCs w:val="22"/>
+        </w:rPr>
+      </w:pPr>
+      <w:r>
+        <w:rPr>
+          <w:rFonts w:eastAsia="Arial" w:cs="Arial"/>
+          <w:color w:val="000000"/>
+          <w:sz w:val="22"/>
+          <w:szCs w:val="22"/>
+        </w:rPr>
+        <w:t>Faça o commit, push da atividade. (Não precisa enviar novamente o link do repositório github caso já tenha enviado, no entanto confirme se as alterações foram enviadas ao repositório remoto no github);</w:t>
       </w:r>
     </w:p>
     <w:p>
@@ -21730,7 +21822,7 @@
         <w:pStyle w:val="ListParagraph"/>
         <w:numPr>
           <w:ilvl w:val="0"/>
-          <w:numId w:val="17"/>
+          <w:numId w:val="24"/>
         </w:numPr>
         <w:spacing w:lineRule="auto" w:line="341" w:before="60" w:after="60"/>
         <w:rPr/>
@@ -21750,7 +21842,7 @@
         <w:pStyle w:val="ListParagraph"/>
         <w:numPr>
           <w:ilvl w:val="0"/>
-          <w:numId w:val="18"/>
+          <w:numId w:val="25"/>
         </w:numPr>
         <w:spacing w:lineRule="auto" w:line="341" w:before="60" w:after="60"/>
         <w:rPr/>
@@ -21770,7 +21862,7 @@
         <w:pStyle w:val="ListParagraph"/>
         <w:numPr>
           <w:ilvl w:val="0"/>
-          <w:numId w:val="19"/>
+          <w:numId w:val="26"/>
         </w:numPr>
         <w:spacing w:lineRule="auto" w:line="341" w:before="60" w:after="60"/>
         <w:rPr/>
@@ -21790,7 +21882,7 @@
         <w:pStyle w:val="ListParagraph"/>
         <w:numPr>
           <w:ilvl w:val="0"/>
-          <w:numId w:val="20"/>
+          <w:numId w:val="27"/>
         </w:numPr>
         <w:spacing w:lineRule="auto" w:line="341" w:before="60" w:after="60"/>
         <w:rPr/>
@@ -21810,7 +21902,7 @@
         <w:pStyle w:val="ListParagraph"/>
         <w:numPr>
           <w:ilvl w:val="0"/>
-          <w:numId w:val="21"/>
+          <w:numId w:val="28"/>
         </w:numPr>
         <w:spacing w:lineRule="auto" w:line="341" w:before="60" w:after="60"/>
         <w:rPr/>
@@ -21830,7 +21922,7 @@
         <w:pStyle w:val="ListParagraph"/>
         <w:numPr>
           <w:ilvl w:val="0"/>
-          <w:numId w:val="22"/>
+          <w:numId w:val="29"/>
         </w:numPr>
         <w:spacing w:lineRule="auto" w:line="341" w:before="60" w:after="60"/>
         <w:rPr/>
@@ -21880,7 +21972,7 @@
         <w:pStyle w:val="ListParagraph"/>
         <w:numPr>
           <w:ilvl w:val="0"/>
-          <w:numId w:val="23"/>
+          <w:numId w:val="30"/>
         </w:numPr>
         <w:spacing w:lineRule="auto" w:line="341" w:before="60" w:after="60"/>
         <w:rPr/>
@@ -21900,7 +21992,7 @@
         <w:pStyle w:val="ListParagraph"/>
         <w:numPr>
           <w:ilvl w:val="0"/>
-          <w:numId w:val="24"/>
+          <w:numId w:val="31"/>
         </w:numPr>
         <w:spacing w:lineRule="auto" w:line="341" w:before="60" w:after="60"/>
         <w:rPr/>
@@ -21920,7 +22012,7 @@
         <w:pStyle w:val="ListParagraph"/>
         <w:numPr>
           <w:ilvl w:val="0"/>
-          <w:numId w:val="25"/>
+          <w:numId w:val="32"/>
         </w:numPr>
         <w:spacing w:lineRule="auto" w:line="341" w:before="60" w:after="60"/>
         <w:rPr/>
@@ -23665,6 +23757,498 @@
   <w:abstractNum w:abstractNumId="12">
     <w:lvl w:ilvl="0">
       <w:start w:val="1"/>
+      <w:numFmt w:val="bullet"/>
+      <w:lvlText w:val=""/>
+      <w:lvlJc w:val="left"/>
+      <w:pPr>
+        <w:tabs>
+          <w:tab w:val="num" w:pos="0"/>
+        </w:tabs>
+        <w:ind w:left="720" w:hanging="360"/>
+      </w:pPr>
+      <w:rPr>
+        <w:rFonts w:ascii="Symbol" w:hAnsi="Symbol" w:cs="Symbol" w:hint="default"/>
+      </w:rPr>
+    </w:lvl>
+    <w:lvl w:ilvl="1">
+      <w:start w:val="1"/>
+      <w:numFmt w:val="bullet"/>
+      <w:lvlText w:val="◦"/>
+      <w:lvlJc w:val="left"/>
+      <w:pPr>
+        <w:tabs>
+          <w:tab w:val="num" w:pos="0"/>
+        </w:tabs>
+        <w:ind w:left="1080" w:hanging="360"/>
+      </w:pPr>
+      <w:rPr>
+        <w:rFonts w:ascii="OpenSymbol" w:hAnsi="OpenSymbol" w:cs="OpenSymbol" w:hint="default"/>
+      </w:rPr>
+    </w:lvl>
+    <w:lvl w:ilvl="2">
+      <w:start w:val="1"/>
+      <w:numFmt w:val="decimal"/>
+      <w:lvlText w:val="%3."/>
+      <w:lvlJc w:val="left"/>
+      <w:pPr>
+        <w:tabs>
+          <w:tab w:val="num" w:pos="1440"/>
+        </w:tabs>
+        <w:ind w:left="1440" w:hanging="360"/>
+      </w:pPr>
+      <w:rPr/>
+    </w:lvl>
+    <w:lvl w:ilvl="3">
+      <w:start w:val="1"/>
+      <w:numFmt w:val="decimal"/>
+      <w:lvlText w:val="%4."/>
+      <w:lvlJc w:val="left"/>
+      <w:pPr>
+        <w:tabs>
+          <w:tab w:val="num" w:pos="1800"/>
+        </w:tabs>
+        <w:ind w:left="1800" w:hanging="360"/>
+      </w:pPr>
+      <w:rPr/>
+    </w:lvl>
+    <w:lvl w:ilvl="4">
+      <w:start w:val="1"/>
+      <w:numFmt w:val="decimal"/>
+      <w:lvlText w:val="%5."/>
+      <w:lvlJc w:val="left"/>
+      <w:pPr>
+        <w:tabs>
+          <w:tab w:val="num" w:pos="2160"/>
+        </w:tabs>
+        <w:ind w:left="2160" w:hanging="360"/>
+      </w:pPr>
+      <w:rPr/>
+    </w:lvl>
+    <w:lvl w:ilvl="5">
+      <w:start w:val="1"/>
+      <w:numFmt w:val="decimal"/>
+      <w:lvlText w:val="%6."/>
+      <w:lvlJc w:val="left"/>
+      <w:pPr>
+        <w:tabs>
+          <w:tab w:val="num" w:pos="2520"/>
+        </w:tabs>
+        <w:ind w:left="2520" w:hanging="360"/>
+      </w:pPr>
+      <w:rPr/>
+    </w:lvl>
+    <w:lvl w:ilvl="6">
+      <w:start w:val="1"/>
+      <w:numFmt w:val="decimal"/>
+      <w:lvlText w:val="%7."/>
+      <w:lvlJc w:val="left"/>
+      <w:pPr>
+        <w:tabs>
+          <w:tab w:val="num" w:pos="2880"/>
+        </w:tabs>
+        <w:ind w:left="2880" w:hanging="360"/>
+      </w:pPr>
+      <w:rPr/>
+    </w:lvl>
+    <w:lvl w:ilvl="7">
+      <w:start w:val="1"/>
+      <w:numFmt w:val="decimal"/>
+      <w:lvlText w:val="%8."/>
+      <w:lvlJc w:val="left"/>
+      <w:pPr>
+        <w:tabs>
+          <w:tab w:val="num" w:pos="3240"/>
+        </w:tabs>
+        <w:ind w:left="3240" w:hanging="360"/>
+      </w:pPr>
+      <w:rPr/>
+    </w:lvl>
+    <w:lvl w:ilvl="8">
+      <w:start w:val="1"/>
+      <w:numFmt w:val="decimal"/>
+      <w:lvlText w:val="%9."/>
+      <w:lvlJc w:val="left"/>
+      <w:pPr>
+        <w:tabs>
+          <w:tab w:val="num" w:pos="3600"/>
+        </w:tabs>
+        <w:ind w:left="3600" w:hanging="360"/>
+      </w:pPr>
+      <w:rPr/>
+    </w:lvl>
+  </w:abstractNum>
+  <w:abstractNum w:abstractNumId="13">
+    <w:lvl w:ilvl="0">
+      <w:start w:val="1"/>
+      <w:numFmt w:val="bullet"/>
+      <w:lvlText w:val=""/>
+      <w:lvlJc w:val="left"/>
+      <w:pPr>
+        <w:tabs>
+          <w:tab w:val="num" w:pos="0"/>
+        </w:tabs>
+        <w:ind w:left="720" w:hanging="360"/>
+      </w:pPr>
+      <w:rPr>
+        <w:rFonts w:ascii="Symbol" w:hAnsi="Symbol" w:cs="Symbol" w:hint="default"/>
+      </w:rPr>
+    </w:lvl>
+    <w:lvl w:ilvl="1">
+      <w:start w:val="1"/>
+      <w:numFmt w:val="bullet"/>
+      <w:lvlText w:val="◦"/>
+      <w:lvlJc w:val="left"/>
+      <w:pPr>
+        <w:tabs>
+          <w:tab w:val="num" w:pos="0"/>
+        </w:tabs>
+        <w:ind w:left="1080" w:hanging="360"/>
+      </w:pPr>
+      <w:rPr>
+        <w:rFonts w:ascii="OpenSymbol" w:hAnsi="OpenSymbol" w:cs="OpenSymbol" w:hint="default"/>
+      </w:rPr>
+    </w:lvl>
+    <w:lvl w:ilvl="2">
+      <w:start w:val="1"/>
+      <w:numFmt w:val="decimal"/>
+      <w:lvlText w:val="%3."/>
+      <w:lvlJc w:val="left"/>
+      <w:pPr>
+        <w:tabs>
+          <w:tab w:val="num" w:pos="1440"/>
+        </w:tabs>
+        <w:ind w:left="1440" w:hanging="360"/>
+      </w:pPr>
+      <w:rPr/>
+    </w:lvl>
+    <w:lvl w:ilvl="3">
+      <w:start w:val="1"/>
+      <w:numFmt w:val="decimal"/>
+      <w:lvlText w:val="%4."/>
+      <w:lvlJc w:val="left"/>
+      <w:pPr>
+        <w:tabs>
+          <w:tab w:val="num" w:pos="1800"/>
+        </w:tabs>
+        <w:ind w:left="1800" w:hanging="360"/>
+      </w:pPr>
+      <w:rPr/>
+    </w:lvl>
+    <w:lvl w:ilvl="4">
+      <w:start w:val="1"/>
+      <w:numFmt w:val="decimal"/>
+      <w:lvlText w:val="%5."/>
+      <w:lvlJc w:val="left"/>
+      <w:pPr>
+        <w:tabs>
+          <w:tab w:val="num" w:pos="2160"/>
+        </w:tabs>
+        <w:ind w:left="2160" w:hanging="360"/>
+      </w:pPr>
+      <w:rPr/>
+    </w:lvl>
+    <w:lvl w:ilvl="5">
+      <w:start w:val="1"/>
+      <w:numFmt w:val="decimal"/>
+      <w:lvlText w:val="%6."/>
+      <w:lvlJc w:val="left"/>
+      <w:pPr>
+        <w:tabs>
+          <w:tab w:val="num" w:pos="2520"/>
+        </w:tabs>
+        <w:ind w:left="2520" w:hanging="360"/>
+      </w:pPr>
+      <w:rPr/>
+    </w:lvl>
+    <w:lvl w:ilvl="6">
+      <w:start w:val="1"/>
+      <w:numFmt w:val="decimal"/>
+      <w:lvlText w:val="%7."/>
+      <w:lvlJc w:val="left"/>
+      <w:pPr>
+        <w:tabs>
+          <w:tab w:val="num" w:pos="2880"/>
+        </w:tabs>
+        <w:ind w:left="2880" w:hanging="360"/>
+      </w:pPr>
+      <w:rPr/>
+    </w:lvl>
+    <w:lvl w:ilvl="7">
+      <w:start w:val="1"/>
+      <w:numFmt w:val="decimal"/>
+      <w:lvlText w:val="%8."/>
+      <w:lvlJc w:val="left"/>
+      <w:pPr>
+        <w:tabs>
+          <w:tab w:val="num" w:pos="3240"/>
+        </w:tabs>
+        <w:ind w:left="3240" w:hanging="360"/>
+      </w:pPr>
+      <w:rPr/>
+    </w:lvl>
+    <w:lvl w:ilvl="8">
+      <w:start w:val="1"/>
+      <w:numFmt w:val="decimal"/>
+      <w:lvlText w:val="%9."/>
+      <w:lvlJc w:val="left"/>
+      <w:pPr>
+        <w:tabs>
+          <w:tab w:val="num" w:pos="3600"/>
+        </w:tabs>
+        <w:ind w:left="3600" w:hanging="360"/>
+      </w:pPr>
+      <w:rPr/>
+    </w:lvl>
+  </w:abstractNum>
+  <w:abstractNum w:abstractNumId="14">
+    <w:lvl w:ilvl="0">
+      <w:start w:val="1"/>
+      <w:numFmt w:val="bullet"/>
+      <w:lvlText w:val=""/>
+      <w:lvlJc w:val="left"/>
+      <w:pPr>
+        <w:tabs>
+          <w:tab w:val="num" w:pos="0"/>
+        </w:tabs>
+        <w:ind w:left="720" w:hanging="360"/>
+      </w:pPr>
+      <w:rPr>
+        <w:rFonts w:ascii="Symbol" w:hAnsi="Symbol" w:cs="Symbol" w:hint="default"/>
+      </w:rPr>
+    </w:lvl>
+    <w:lvl w:ilvl="1">
+      <w:start w:val="1"/>
+      <w:numFmt w:val="bullet"/>
+      <w:lvlText w:val="◦"/>
+      <w:lvlJc w:val="left"/>
+      <w:pPr>
+        <w:tabs>
+          <w:tab w:val="num" w:pos="0"/>
+        </w:tabs>
+        <w:ind w:left="1080" w:hanging="360"/>
+      </w:pPr>
+      <w:rPr>
+        <w:rFonts w:ascii="OpenSymbol" w:hAnsi="OpenSymbol" w:cs="OpenSymbol" w:hint="default"/>
+      </w:rPr>
+    </w:lvl>
+    <w:lvl w:ilvl="2">
+      <w:start w:val="1"/>
+      <w:numFmt w:val="decimal"/>
+      <w:lvlText w:val="%3."/>
+      <w:lvlJc w:val="left"/>
+      <w:pPr>
+        <w:tabs>
+          <w:tab w:val="num" w:pos="1440"/>
+        </w:tabs>
+        <w:ind w:left="1440" w:hanging="360"/>
+      </w:pPr>
+      <w:rPr/>
+    </w:lvl>
+    <w:lvl w:ilvl="3">
+      <w:start w:val="1"/>
+      <w:numFmt w:val="decimal"/>
+      <w:lvlText w:val="%4."/>
+      <w:lvlJc w:val="left"/>
+      <w:pPr>
+        <w:tabs>
+          <w:tab w:val="num" w:pos="1800"/>
+        </w:tabs>
+        <w:ind w:left="1800" w:hanging="360"/>
+      </w:pPr>
+      <w:rPr/>
+    </w:lvl>
+    <w:lvl w:ilvl="4">
+      <w:start w:val="1"/>
+      <w:numFmt w:val="decimal"/>
+      <w:lvlText w:val="%5."/>
+      <w:lvlJc w:val="left"/>
+      <w:pPr>
+        <w:tabs>
+          <w:tab w:val="num" w:pos="2160"/>
+        </w:tabs>
+        <w:ind w:left="2160" w:hanging="360"/>
+      </w:pPr>
+      <w:rPr/>
+    </w:lvl>
+    <w:lvl w:ilvl="5">
+      <w:start w:val="1"/>
+      <w:numFmt w:val="decimal"/>
+      <w:lvlText w:val="%6."/>
+      <w:lvlJc w:val="left"/>
+      <w:pPr>
+        <w:tabs>
+          <w:tab w:val="num" w:pos="2520"/>
+        </w:tabs>
+        <w:ind w:left="2520" w:hanging="360"/>
+      </w:pPr>
+      <w:rPr/>
+    </w:lvl>
+    <w:lvl w:ilvl="6">
+      <w:start w:val="1"/>
+      <w:numFmt w:val="decimal"/>
+      <w:lvlText w:val="%7."/>
+      <w:lvlJc w:val="left"/>
+      <w:pPr>
+        <w:tabs>
+          <w:tab w:val="num" w:pos="2880"/>
+        </w:tabs>
+        <w:ind w:left="2880" w:hanging="360"/>
+      </w:pPr>
+      <w:rPr/>
+    </w:lvl>
+    <w:lvl w:ilvl="7">
+      <w:start w:val="1"/>
+      <w:numFmt w:val="decimal"/>
+      <w:lvlText w:val="%8."/>
+      <w:lvlJc w:val="left"/>
+      <w:pPr>
+        <w:tabs>
+          <w:tab w:val="num" w:pos="3240"/>
+        </w:tabs>
+        <w:ind w:left="3240" w:hanging="360"/>
+      </w:pPr>
+      <w:rPr/>
+    </w:lvl>
+    <w:lvl w:ilvl="8">
+      <w:start w:val="1"/>
+      <w:numFmt w:val="decimal"/>
+      <w:lvlText w:val="%9."/>
+      <w:lvlJc w:val="left"/>
+      <w:pPr>
+        <w:tabs>
+          <w:tab w:val="num" w:pos="3600"/>
+        </w:tabs>
+        <w:ind w:left="3600" w:hanging="360"/>
+      </w:pPr>
+      <w:rPr/>
+    </w:lvl>
+  </w:abstractNum>
+  <w:abstractNum w:abstractNumId="15">
+    <w:lvl w:ilvl="0">
+      <w:start w:val="1"/>
+      <w:numFmt w:val="bullet"/>
+      <w:lvlText w:val=""/>
+      <w:lvlJc w:val="left"/>
+      <w:pPr>
+        <w:tabs>
+          <w:tab w:val="num" w:pos="0"/>
+        </w:tabs>
+        <w:ind w:left="720" w:hanging="360"/>
+      </w:pPr>
+      <w:rPr>
+        <w:rFonts w:ascii="Symbol" w:hAnsi="Symbol" w:cs="Symbol" w:hint="default"/>
+      </w:rPr>
+    </w:lvl>
+    <w:lvl w:ilvl="1">
+      <w:start w:val="1"/>
+      <w:numFmt w:val="bullet"/>
+      <w:lvlText w:val="◦"/>
+      <w:lvlJc w:val="left"/>
+      <w:pPr>
+        <w:tabs>
+          <w:tab w:val="num" w:pos="0"/>
+        </w:tabs>
+        <w:ind w:left="1080" w:hanging="360"/>
+      </w:pPr>
+      <w:rPr>
+        <w:rFonts w:ascii="OpenSymbol" w:hAnsi="OpenSymbol" w:cs="OpenSymbol" w:hint="default"/>
+      </w:rPr>
+    </w:lvl>
+    <w:lvl w:ilvl="2">
+      <w:start w:val="1"/>
+      <w:numFmt w:val="decimal"/>
+      <w:lvlText w:val="%3."/>
+      <w:lvlJc w:val="left"/>
+      <w:pPr>
+        <w:tabs>
+          <w:tab w:val="num" w:pos="1440"/>
+        </w:tabs>
+        <w:ind w:left="1440" w:hanging="360"/>
+      </w:pPr>
+      <w:rPr/>
+    </w:lvl>
+    <w:lvl w:ilvl="3">
+      <w:start w:val="1"/>
+      <w:numFmt w:val="decimal"/>
+      <w:lvlText w:val="%4."/>
+      <w:lvlJc w:val="left"/>
+      <w:pPr>
+        <w:tabs>
+          <w:tab w:val="num" w:pos="1800"/>
+        </w:tabs>
+        <w:ind w:left="1800" w:hanging="360"/>
+      </w:pPr>
+      <w:rPr/>
+    </w:lvl>
+    <w:lvl w:ilvl="4">
+      <w:start w:val="1"/>
+      <w:numFmt w:val="decimal"/>
+      <w:lvlText w:val="%5."/>
+      <w:lvlJc w:val="left"/>
+      <w:pPr>
+        <w:tabs>
+          <w:tab w:val="num" w:pos="2160"/>
+        </w:tabs>
+        <w:ind w:left="2160" w:hanging="360"/>
+      </w:pPr>
+      <w:rPr/>
+    </w:lvl>
+    <w:lvl w:ilvl="5">
+      <w:start w:val="1"/>
+      <w:numFmt w:val="decimal"/>
+      <w:lvlText w:val="%6."/>
+      <w:lvlJc w:val="left"/>
+      <w:pPr>
+        <w:tabs>
+          <w:tab w:val="num" w:pos="2520"/>
+        </w:tabs>
+        <w:ind w:left="2520" w:hanging="360"/>
+      </w:pPr>
+      <w:rPr/>
+    </w:lvl>
+    <w:lvl w:ilvl="6">
+      <w:start w:val="1"/>
+      <w:numFmt w:val="decimal"/>
+      <w:lvlText w:val="%7."/>
+      <w:lvlJc w:val="left"/>
+      <w:pPr>
+        <w:tabs>
+          <w:tab w:val="num" w:pos="2880"/>
+        </w:tabs>
+        <w:ind w:left="2880" w:hanging="360"/>
+      </w:pPr>
+      <w:rPr/>
+    </w:lvl>
+    <w:lvl w:ilvl="7">
+      <w:start w:val="1"/>
+      <w:numFmt w:val="decimal"/>
+      <w:lvlText w:val="%8."/>
+      <w:lvlJc w:val="left"/>
+      <w:pPr>
+        <w:tabs>
+          <w:tab w:val="num" w:pos="3240"/>
+        </w:tabs>
+        <w:ind w:left="3240" w:hanging="360"/>
+      </w:pPr>
+      <w:rPr/>
+    </w:lvl>
+    <w:lvl w:ilvl="8">
+      <w:start w:val="1"/>
+      <w:numFmt w:val="decimal"/>
+      <w:lvlText w:val="%9."/>
+      <w:lvlJc w:val="left"/>
+      <w:pPr>
+        <w:tabs>
+          <w:tab w:val="num" w:pos="3600"/>
+        </w:tabs>
+        <w:ind w:left="3600" w:hanging="360"/>
+      </w:pPr>
+      <w:rPr/>
+    </w:lvl>
+  </w:abstractNum>
+  <w:abstractNum w:abstractNumId="16">
+    <w:lvl w:ilvl="0">
+      <w:start w:val="1"/>
       <w:numFmt w:val="none"/>
       <w:suff w:val="nothing"/>
       <w:lvlText w:val=""/>
@@ -23818,46 +24402,67 @@
     <w:abstractNumId w:val="12"/>
   </w:num>
   <w:num w:numId="13">
-    <w:abstractNumId w:val="1"/>
+    <w:abstractNumId w:val="13"/>
+  </w:num>
+  <w:num w:numId="14">
+    <w:abstractNumId w:val="14"/>
+  </w:num>
+  <w:num w:numId="15">
+    <w:abstractNumId w:val="15"/>
+  </w:num>
+  <w:num w:numId="16">
+    <w:abstractNumId w:val="16"/>
+  </w:num>
+  <w:num w:numId="17">
+    <w:abstractNumId w:val="2"/>
     <w:lvlOverride w:ilvl="0">
       <w:startOverride w:val="1"/>
     </w:lvlOverride>
   </w:num>
-  <w:num w:numId="14">
-    <w:abstractNumId w:val="1"/>
-  </w:num>
-  <w:num w:numId="15">
-    <w:abstractNumId w:val="1"/>
-  </w:num>
-  <w:num w:numId="16">
-    <w:abstractNumId w:val="1"/>
-  </w:num>
-  <w:num w:numId="17">
-    <w:abstractNumId w:val="1"/>
-  </w:num>
   <w:num w:numId="18">
-    <w:abstractNumId w:val="1"/>
+    <w:abstractNumId w:val="2"/>
   </w:num>
   <w:num w:numId="19">
-    <w:abstractNumId w:val="1"/>
+    <w:abstractNumId w:val="2"/>
   </w:num>
   <w:num w:numId="20">
-    <w:abstractNumId w:val="1"/>
+    <w:abstractNumId w:val="2"/>
   </w:num>
   <w:num w:numId="21">
-    <w:abstractNumId w:val="1"/>
+    <w:abstractNumId w:val="2"/>
   </w:num>
   <w:num w:numId="22">
-    <w:abstractNumId w:val="1"/>
+    <w:abstractNumId w:val="2"/>
   </w:num>
   <w:num w:numId="23">
-    <w:abstractNumId w:val="1"/>
+    <w:abstractNumId w:val="2"/>
   </w:num>
   <w:num w:numId="24">
-    <w:abstractNumId w:val="1"/>
+    <w:abstractNumId w:val="2"/>
   </w:num>
   <w:num w:numId="25">
-    <w:abstractNumId w:val="1"/>
+    <w:abstractNumId w:val="2"/>
+  </w:num>
+  <w:num w:numId="26">
+    <w:abstractNumId w:val="2"/>
+  </w:num>
+  <w:num w:numId="27">
+    <w:abstractNumId w:val="2"/>
+  </w:num>
+  <w:num w:numId="28">
+    <w:abstractNumId w:val="2"/>
+  </w:num>
+  <w:num w:numId="29">
+    <w:abstractNumId w:val="2"/>
+  </w:num>
+  <w:num w:numId="30">
+    <w:abstractNumId w:val="2"/>
+  </w:num>
+  <w:num w:numId="31">
+    <w:abstractNumId w:val="2"/>
+  </w:num>
+  <w:num w:numId="32">
+    <w:abstractNumId w:val="2"/>
   </w:num>
 </w:numbering>
 </file>

</xml_diff>